<commit_message>
xac nhan dat hang
</commit_message>
<xml_diff>
--- a/BaoCao_TienDo_ThanhVien2.docx
+++ b/BaoCao_TienDo_ThanhVien2.docx
@@ -8305,6 +8305,378 @@
       </w:pPr>
       <w:r>
         <w:t>Người thực hiện: Thành viên 2 (Backend &amp; Frontend)</w:t>
+      </w:r>
+    </w:p>
+    <w:p>
+      <w:pPr>
+        <w:spacing w:after="120"/>
+      </w:pPr>
+    </w:p>
+    <w:p>
+      <w:pPr>
+        <w:spacing w:after="120"/>
+      </w:pPr>
+    </w:p>
+    <w:p>
+      <w:pPr>
+        <w:spacing w:after="120"/>
+      </w:pPr>
+    </w:p>
+    <w:p>
+      <w:pPr>
+        <w:spacing w:after="120"/>
+      </w:pPr>
+    </w:p>
+    <w:p>
+      <w:pPr>
+        <w:spacing w:after="120"/>
+      </w:pPr>
+      <w:r>
+        <w:t xml:space="preserve">16/5/2026 : </w:t>
+      </w:r>
+    </w:p>
+    <w:p>
+      <w:pPr>
+        <w:spacing w:after="120"/>
+      </w:pPr>
+      <w:r>
+        <w:rPr>
+          <w:b/>
+          <w:bCs/>
+        </w:rPr>
+        <w:t>Tóm tắt các thay đổi:</w:t>
+      </w:r>
+    </w:p>
+    <w:p>
+      <w:pPr>
+        <w:numPr>
+          <w:ilvl w:val="0"/>
+          <w:numId w:val="13"/>
+        </w:numPr>
+        <w:spacing w:after="120"/>
+      </w:pPr>
+      <w:r>
+        <w:rPr>
+          <w:b/>
+          <w:bCs/>
+        </w:rPr>
+        <w:t>Thêm hàm formatDate</w:t>
+      </w:r>
+      <w:r>
+        <w:t> - Hiển thị ngày đặt hàng theo format dd/mm/yyyy, hh:mm</w:t>
+      </w:r>
+    </w:p>
+    <w:p>
+      <w:pPr>
+        <w:numPr>
+          <w:ilvl w:val="0"/>
+          <w:numId w:val="13"/>
+        </w:numPr>
+        <w:spacing w:after="120"/>
+      </w:pPr>
+      <w:r>
+        <w:rPr>
+          <w:b/>
+          <w:bCs/>
+        </w:rPr>
+        <w:t>Thêm cột "Người đặt"</w:t>
+      </w:r>
+      <w:r>
+        <w:t> - Hiển thị tên user đã đặt hàng, hoặc "Khách vãng lai" nếu không có tài khoản</w:t>
+      </w:r>
+    </w:p>
+    <w:p>
+      <w:pPr>
+        <w:numPr>
+          <w:ilvl w:val="0"/>
+          <w:numId w:val="13"/>
+        </w:numPr>
+        <w:spacing w:after="120"/>
+      </w:pPr>
+      <w:r>
+        <w:rPr>
+          <w:b/>
+          <w:bCs/>
+        </w:rPr>
+        <w:t>Thêm cột "Ngày đặt"</w:t>
+      </w:r>
+      <w:r>
+        <w:t> - Hiển thị thời gian đặt hàng</w:t>
+      </w:r>
+    </w:p>
+    <w:p>
+      <w:pPr>
+        <w:numPr>
+          <w:ilvl w:val="0"/>
+          <w:numId w:val="13"/>
+        </w:numPr>
+        <w:spacing w:after="120"/>
+      </w:pPr>
+      <w:r>
+        <w:rPr>
+          <w:b/>
+          <w:bCs/>
+        </w:rPr>
+        <w:lastRenderedPageBreak/>
+        <w:t>Thêm nhãn "</w:t>
+      </w:r>
+      <w:r>
+        <w:rPr>
+          <w:rFonts w:ascii="Segoe UI Emoji" w:hAnsi="Segoe UI Emoji" w:cs="Segoe UI Emoji"/>
+          <w:b/>
+          <w:bCs/>
+        </w:rPr>
+        <w:t>📦</w:t>
+      </w:r>
+      <w:r>
+        <w:rPr>
+          <w:b/>
+          <w:bCs/>
+        </w:rPr>
+        <w:t xml:space="preserve"> Sản phẩm:"</w:t>
+      </w:r>
+      <w:r>
+        <w:t> - Rõ ràng hơn trong phần mở rộng</w:t>
+      </w:r>
+    </w:p>
+    <w:p>
+      <w:pPr>
+        <w:numPr>
+          <w:ilvl w:val="0"/>
+          <w:numId w:val="13"/>
+        </w:numPr>
+        <w:spacing w:after="120"/>
+      </w:pPr>
+      <w:r>
+        <w:rPr>
+          <w:b/>
+          <w:bCs/>
+        </w:rPr>
+        <w:t>Sửa nút "Xác nhận đơn"</w:t>
+      </w:r>
+      <w:r>
+        <w:t> - Thay đổi text từ "→ Chuyển sang: ..." thành "</w:t>
+      </w:r>
+      <w:r>
+        <w:rPr>
+          <w:rFonts w:ascii="Segoe UI Symbol" w:hAnsi="Segoe UI Symbol" w:cs="Segoe UI Symbol"/>
+        </w:rPr>
+        <w:t>✓</w:t>
+      </w:r>
+      <w:r>
+        <w:t xml:space="preserve"> X</w:t>
+      </w:r>
+      <w:r>
+        <w:rPr>
+          <w:rFonts w:ascii="Cambria" w:hAnsi="Cambria" w:cs="Cambria"/>
+        </w:rPr>
+        <w:t>á</w:t>
+      </w:r>
+      <w:r>
+        <w:t>c nhận đơn" cho trực quan hơn</w:t>
+      </w:r>
+    </w:p>
+    <w:p>
+      <w:pPr>
+        <w:numPr>
+          <w:ilvl w:val="0"/>
+          <w:numId w:val="13"/>
+        </w:numPr>
+        <w:spacing w:after="120"/>
+      </w:pPr>
+      <w:r>
+        <w:rPr>
+          <w:b/>
+          <w:bCs/>
+        </w:rPr>
+        <w:t>Sửa lỗi tên trạng thái</w:t>
+      </w:r>
+      <w:r>
+        <w:t> - CANCELED → CANCELLED để khớp với backend</w:t>
+      </w:r>
+    </w:p>
+    <w:p>
+      <w:pPr>
+        <w:numPr>
+          <w:ilvl w:val="0"/>
+          <w:numId w:val="13"/>
+        </w:numPr>
+        <w:spacing w:after="120"/>
+      </w:pPr>
+      <w:r>
+        <w:rPr>
+          <w:b/>
+          <w:bCs/>
+        </w:rPr>
+        <w:t>Sửa màu CONFIRMED</w:t>
+      </w:r>
+      <w:r>
+        <w:t> - #3b82f6 → #22c55e để hiển thị màu xanh (khung xanh) đúng như yêu cầu</w:t>
+      </w:r>
+    </w:p>
+    <w:p>
+      <w:pPr>
+        <w:numPr>
+          <w:ilvl w:val="0"/>
+          <w:numId w:val="13"/>
+        </w:numPr>
+        <w:spacing w:after="120"/>
+      </w:pPr>
+      <w:r>
+        <w:rPr>
+          <w:b/>
+          <w:bCs/>
+        </w:rPr>
+        <w:t>Sửa API request</w:t>
+      </w:r>
+      <w:r>
+        <w:t> - Đổi status → order_status để khớp với backend</w:t>
+      </w:r>
+    </w:p>
+    <w:p>
+      <w:pPr>
+        <w:spacing w:after="120"/>
+      </w:pPr>
+      <w:r>
+        <w:rPr>
+          <w:b/>
+          <w:bCs/>
+        </w:rPr>
+        <w:t>Giao diện mới sẽ hiển thị:</w:t>
+      </w:r>
+    </w:p>
+    <w:p>
+      <w:pPr>
+        <w:numPr>
+          <w:ilvl w:val="0"/>
+          <w:numId w:val="14"/>
+        </w:numPr>
+        <w:spacing w:after="120"/>
+      </w:pPr>
+      <w:r>
+        <w:t>Mã đơn</w:t>
+      </w:r>
+    </w:p>
+    <w:p>
+      <w:pPr>
+        <w:numPr>
+          <w:ilvl w:val="0"/>
+          <w:numId w:val="14"/>
+        </w:numPr>
+        <w:spacing w:after="120"/>
+      </w:pPr>
+      <w:r>
+        <w:t>Khách hàng (tên + SĐT)</w:t>
+      </w:r>
+    </w:p>
+    <w:p>
+      <w:pPr>
+        <w:numPr>
+          <w:ilvl w:val="0"/>
+          <w:numId w:val="14"/>
+        </w:numPr>
+        <w:spacing w:after="120"/>
+      </w:pPr>
+      <w:r>
+        <w:t>Người đặt (tên user hoặc "Khách vãng lai")</w:t>
+      </w:r>
+    </w:p>
+    <w:p>
+      <w:pPr>
+        <w:numPr>
+          <w:ilvl w:val="0"/>
+          <w:numId w:val="14"/>
+        </w:numPr>
+        <w:spacing w:after="120"/>
+      </w:pPr>
+      <w:r>
+        <w:t>Ngày đặt (ngày giờ)</w:t>
+      </w:r>
+    </w:p>
+    <w:p>
+      <w:pPr>
+        <w:numPr>
+          <w:ilvl w:val="0"/>
+          <w:numId w:val="14"/>
+        </w:numPr>
+        <w:spacing w:after="120"/>
+      </w:pPr>
+      <w:r>
+        <w:t>Trạng thái (với màu xanh cho "Đã xác nhận")</w:t>
+      </w:r>
+    </w:p>
+    <w:p>
+      <w:pPr>
+        <w:spacing w:after="120"/>
+      </w:pPr>
+      <w:r>
+        <w:t>Khi click mở rộng sẽ thấy:</w:t>
+      </w:r>
+    </w:p>
+    <w:p>
+      <w:pPr>
+        <w:numPr>
+          <w:ilvl w:val="0"/>
+          <w:numId w:val="15"/>
+        </w:numPr>
+        <w:spacing w:after="120"/>
+      </w:pPr>
+      <w:r>
+        <w:t>Danh sách sản phẩm (tên + SKU + số lượng + giá)</w:t>
+      </w:r>
+    </w:p>
+    <w:p>
+      <w:pPr>
+        <w:numPr>
+          <w:ilvl w:val="0"/>
+          <w:numId w:val="15"/>
+        </w:numPr>
+        <w:spacing w:after="120"/>
+      </w:pPr>
+      <w:r>
+        <w:t>Tổng tiền</w:t>
+      </w:r>
+    </w:p>
+    <w:p>
+      <w:pPr>
+        <w:numPr>
+          <w:ilvl w:val="0"/>
+          <w:numId w:val="15"/>
+        </w:numPr>
+        <w:spacing w:after="120"/>
+      </w:pPr>
+      <w:r>
+        <w:t>Địa chỉ giao hàng</w:t>
+      </w:r>
+    </w:p>
+    <w:p>
+      <w:pPr>
+        <w:numPr>
+          <w:ilvl w:val="0"/>
+          <w:numId w:val="15"/>
+        </w:numPr>
+        <w:spacing w:after="120"/>
+      </w:pPr>
+      <w:r>
+        <w:t>Nút "</w:t>
+      </w:r>
+      <w:r>
+        <w:rPr>
+          <w:rFonts w:ascii="Segoe UI Symbol" w:hAnsi="Segoe UI Symbol" w:cs="Segoe UI Symbol"/>
+        </w:rPr>
+        <w:t>✓</w:t>
+      </w:r>
+      <w:r>
+        <w:t xml:space="preserve"> X</w:t>
+      </w:r>
+      <w:r>
+        <w:rPr>
+          <w:rFonts w:ascii="Cambria" w:hAnsi="Cambria" w:cs="Cambria"/>
+        </w:rPr>
+        <w:t>á</w:t>
+      </w:r>
+      <w:r>
+        <w:t>c nhận đơn" (màu xanh) và "Hủy đơn" (màu đỏ)</w:t>
       </w:r>
     </w:p>
     <w:p>
@@ -8501,6 +8873,155 @@
     </w:lvl>
   </w:abstractNum>
   <w:abstractNum w:abstractNumId="9" w15:restartNumberingAfterBreak="0">
+    <w:nsid w:val="06496113"/>
+    <w:multiLevelType w:val="multilevel"/>
+    <w:tmpl w:val="C8B69244"/>
+    <w:lvl w:ilvl="0">
+      <w:start w:val="1"/>
+      <w:numFmt w:val="bullet"/>
+      <w:lvlText w:val=""/>
+      <w:lvlJc w:val="left"/>
+      <w:pPr>
+        <w:tabs>
+          <w:tab w:val="num" w:pos="720"/>
+        </w:tabs>
+        <w:ind w:left="720" w:hanging="360"/>
+      </w:pPr>
+      <w:rPr>
+        <w:rFonts w:ascii="Symbol" w:hAnsi="Symbol" w:hint="default"/>
+        <w:sz w:val="20"/>
+      </w:rPr>
+    </w:lvl>
+    <w:lvl w:ilvl="1" w:tentative="1">
+      <w:start w:val="1"/>
+      <w:numFmt w:val="bullet"/>
+      <w:lvlText w:val=""/>
+      <w:lvlJc w:val="left"/>
+      <w:pPr>
+        <w:tabs>
+          <w:tab w:val="num" w:pos="1440"/>
+        </w:tabs>
+        <w:ind w:left="1440" w:hanging="360"/>
+      </w:pPr>
+      <w:rPr>
+        <w:rFonts w:ascii="Symbol" w:hAnsi="Symbol" w:hint="default"/>
+        <w:sz w:val="20"/>
+      </w:rPr>
+    </w:lvl>
+    <w:lvl w:ilvl="2" w:tentative="1">
+      <w:start w:val="1"/>
+      <w:numFmt w:val="bullet"/>
+      <w:lvlText w:val=""/>
+      <w:lvlJc w:val="left"/>
+      <w:pPr>
+        <w:tabs>
+          <w:tab w:val="num" w:pos="2160"/>
+        </w:tabs>
+        <w:ind w:left="2160" w:hanging="360"/>
+      </w:pPr>
+      <w:rPr>
+        <w:rFonts w:ascii="Symbol" w:hAnsi="Symbol" w:hint="default"/>
+        <w:sz w:val="20"/>
+      </w:rPr>
+    </w:lvl>
+    <w:lvl w:ilvl="3" w:tentative="1">
+      <w:start w:val="1"/>
+      <w:numFmt w:val="bullet"/>
+      <w:lvlText w:val=""/>
+      <w:lvlJc w:val="left"/>
+      <w:pPr>
+        <w:tabs>
+          <w:tab w:val="num" w:pos="2880"/>
+        </w:tabs>
+        <w:ind w:left="2880" w:hanging="360"/>
+      </w:pPr>
+      <w:rPr>
+        <w:rFonts w:ascii="Symbol" w:hAnsi="Symbol" w:hint="default"/>
+        <w:sz w:val="20"/>
+      </w:rPr>
+    </w:lvl>
+    <w:lvl w:ilvl="4" w:tentative="1">
+      <w:start w:val="1"/>
+      <w:numFmt w:val="bullet"/>
+      <w:lvlText w:val=""/>
+      <w:lvlJc w:val="left"/>
+      <w:pPr>
+        <w:tabs>
+          <w:tab w:val="num" w:pos="3600"/>
+        </w:tabs>
+        <w:ind w:left="3600" w:hanging="360"/>
+      </w:pPr>
+      <w:rPr>
+        <w:rFonts w:ascii="Symbol" w:hAnsi="Symbol" w:hint="default"/>
+        <w:sz w:val="20"/>
+      </w:rPr>
+    </w:lvl>
+    <w:lvl w:ilvl="5" w:tentative="1">
+      <w:start w:val="1"/>
+      <w:numFmt w:val="bullet"/>
+      <w:lvlText w:val=""/>
+      <w:lvlJc w:val="left"/>
+      <w:pPr>
+        <w:tabs>
+          <w:tab w:val="num" w:pos="4320"/>
+        </w:tabs>
+        <w:ind w:left="4320" w:hanging="360"/>
+      </w:pPr>
+      <w:rPr>
+        <w:rFonts w:ascii="Symbol" w:hAnsi="Symbol" w:hint="default"/>
+        <w:sz w:val="20"/>
+      </w:rPr>
+    </w:lvl>
+    <w:lvl w:ilvl="6" w:tentative="1">
+      <w:start w:val="1"/>
+      <w:numFmt w:val="bullet"/>
+      <w:lvlText w:val=""/>
+      <w:lvlJc w:val="left"/>
+      <w:pPr>
+        <w:tabs>
+          <w:tab w:val="num" w:pos="5040"/>
+        </w:tabs>
+        <w:ind w:left="5040" w:hanging="360"/>
+      </w:pPr>
+      <w:rPr>
+        <w:rFonts w:ascii="Symbol" w:hAnsi="Symbol" w:hint="default"/>
+        <w:sz w:val="20"/>
+      </w:rPr>
+    </w:lvl>
+    <w:lvl w:ilvl="7" w:tentative="1">
+      <w:start w:val="1"/>
+      <w:numFmt w:val="bullet"/>
+      <w:lvlText w:val=""/>
+      <w:lvlJc w:val="left"/>
+      <w:pPr>
+        <w:tabs>
+          <w:tab w:val="num" w:pos="5760"/>
+        </w:tabs>
+        <w:ind w:left="5760" w:hanging="360"/>
+      </w:pPr>
+      <w:rPr>
+        <w:rFonts w:ascii="Symbol" w:hAnsi="Symbol" w:hint="default"/>
+        <w:sz w:val="20"/>
+      </w:rPr>
+    </w:lvl>
+    <w:lvl w:ilvl="8" w:tentative="1">
+      <w:start w:val="1"/>
+      <w:numFmt w:val="bullet"/>
+      <w:lvlText w:val=""/>
+      <w:lvlJc w:val="left"/>
+      <w:pPr>
+        <w:tabs>
+          <w:tab w:val="num" w:pos="6480"/>
+        </w:tabs>
+        <w:ind w:left="6480" w:hanging="360"/>
+      </w:pPr>
+      <w:rPr>
+        <w:rFonts w:ascii="Symbol" w:hAnsi="Symbol" w:hint="default"/>
+        <w:sz w:val="20"/>
+      </w:rPr>
+    </w:lvl>
+  </w:abstractNum>
+  <w:abstractNum w:abstractNumId="10" w15:restartNumberingAfterBreak="0">
     <w:nsid w:val="0EF17600"/>
     <w:multiLevelType w:val="multilevel"/>
     <w:tmpl w:val="4414101C"/>
@@ -8613,7 +9134,7 @@
       </w:pPr>
     </w:lvl>
   </w:abstractNum>
-  <w:abstractNum w:abstractNumId="10" w15:restartNumberingAfterBreak="0">
+  <w:abstractNum w:abstractNumId="11" w15:restartNumberingAfterBreak="0">
     <w:nsid w:val="49340DC8"/>
     <w:multiLevelType w:val="multilevel"/>
     <w:tmpl w:val="DDC44B78"/>
@@ -8726,10 +9247,272 @@
       </w:pPr>
     </w:lvl>
   </w:abstractNum>
-  <w:abstractNum w:abstractNumId="11" w15:restartNumberingAfterBreak="0">
+  <w:abstractNum w:abstractNumId="12" w15:restartNumberingAfterBreak="0">
     <w:nsid w:val="53495B6A"/>
     <w:multiLevelType w:val="multilevel"/>
     <w:tmpl w:val="5B7CF5FA"/>
+    <w:lvl w:ilvl="0">
+      <w:start w:val="1"/>
+      <w:numFmt w:val="bullet"/>
+      <w:lvlText w:val=""/>
+      <w:lvlJc w:val="left"/>
+      <w:pPr>
+        <w:tabs>
+          <w:tab w:val="num" w:pos="720"/>
+        </w:tabs>
+        <w:ind w:left="720" w:hanging="360"/>
+      </w:pPr>
+      <w:rPr>
+        <w:rFonts w:ascii="Symbol" w:hAnsi="Symbol" w:hint="default"/>
+        <w:sz w:val="20"/>
+      </w:rPr>
+    </w:lvl>
+    <w:lvl w:ilvl="1" w:tentative="1">
+      <w:start w:val="1"/>
+      <w:numFmt w:val="bullet"/>
+      <w:lvlText w:val=""/>
+      <w:lvlJc w:val="left"/>
+      <w:pPr>
+        <w:tabs>
+          <w:tab w:val="num" w:pos="1440"/>
+        </w:tabs>
+        <w:ind w:left="1440" w:hanging="360"/>
+      </w:pPr>
+      <w:rPr>
+        <w:rFonts w:ascii="Symbol" w:hAnsi="Symbol" w:hint="default"/>
+        <w:sz w:val="20"/>
+      </w:rPr>
+    </w:lvl>
+    <w:lvl w:ilvl="2" w:tentative="1">
+      <w:start w:val="1"/>
+      <w:numFmt w:val="bullet"/>
+      <w:lvlText w:val=""/>
+      <w:lvlJc w:val="left"/>
+      <w:pPr>
+        <w:tabs>
+          <w:tab w:val="num" w:pos="2160"/>
+        </w:tabs>
+        <w:ind w:left="2160" w:hanging="360"/>
+      </w:pPr>
+      <w:rPr>
+        <w:rFonts w:ascii="Symbol" w:hAnsi="Symbol" w:hint="default"/>
+        <w:sz w:val="20"/>
+      </w:rPr>
+    </w:lvl>
+    <w:lvl w:ilvl="3" w:tentative="1">
+      <w:start w:val="1"/>
+      <w:numFmt w:val="bullet"/>
+      <w:lvlText w:val=""/>
+      <w:lvlJc w:val="left"/>
+      <w:pPr>
+        <w:tabs>
+          <w:tab w:val="num" w:pos="2880"/>
+        </w:tabs>
+        <w:ind w:left="2880" w:hanging="360"/>
+      </w:pPr>
+      <w:rPr>
+        <w:rFonts w:ascii="Symbol" w:hAnsi="Symbol" w:hint="default"/>
+        <w:sz w:val="20"/>
+      </w:rPr>
+    </w:lvl>
+    <w:lvl w:ilvl="4" w:tentative="1">
+      <w:start w:val="1"/>
+      <w:numFmt w:val="bullet"/>
+      <w:lvlText w:val=""/>
+      <w:lvlJc w:val="left"/>
+      <w:pPr>
+        <w:tabs>
+          <w:tab w:val="num" w:pos="3600"/>
+        </w:tabs>
+        <w:ind w:left="3600" w:hanging="360"/>
+      </w:pPr>
+      <w:rPr>
+        <w:rFonts w:ascii="Symbol" w:hAnsi="Symbol" w:hint="default"/>
+        <w:sz w:val="20"/>
+      </w:rPr>
+    </w:lvl>
+    <w:lvl w:ilvl="5" w:tentative="1">
+      <w:start w:val="1"/>
+      <w:numFmt w:val="bullet"/>
+      <w:lvlText w:val=""/>
+      <w:lvlJc w:val="left"/>
+      <w:pPr>
+        <w:tabs>
+          <w:tab w:val="num" w:pos="4320"/>
+        </w:tabs>
+        <w:ind w:left="4320" w:hanging="360"/>
+      </w:pPr>
+      <w:rPr>
+        <w:rFonts w:ascii="Symbol" w:hAnsi="Symbol" w:hint="default"/>
+        <w:sz w:val="20"/>
+      </w:rPr>
+    </w:lvl>
+    <w:lvl w:ilvl="6" w:tentative="1">
+      <w:start w:val="1"/>
+      <w:numFmt w:val="bullet"/>
+      <w:lvlText w:val=""/>
+      <w:lvlJc w:val="left"/>
+      <w:pPr>
+        <w:tabs>
+          <w:tab w:val="num" w:pos="5040"/>
+        </w:tabs>
+        <w:ind w:left="5040" w:hanging="360"/>
+      </w:pPr>
+      <w:rPr>
+        <w:rFonts w:ascii="Symbol" w:hAnsi="Symbol" w:hint="default"/>
+        <w:sz w:val="20"/>
+      </w:rPr>
+    </w:lvl>
+    <w:lvl w:ilvl="7" w:tentative="1">
+      <w:start w:val="1"/>
+      <w:numFmt w:val="bullet"/>
+      <w:lvlText w:val=""/>
+      <w:lvlJc w:val="left"/>
+      <w:pPr>
+        <w:tabs>
+          <w:tab w:val="num" w:pos="5760"/>
+        </w:tabs>
+        <w:ind w:left="5760" w:hanging="360"/>
+      </w:pPr>
+      <w:rPr>
+        <w:rFonts w:ascii="Symbol" w:hAnsi="Symbol" w:hint="default"/>
+        <w:sz w:val="20"/>
+      </w:rPr>
+    </w:lvl>
+    <w:lvl w:ilvl="8" w:tentative="1">
+      <w:start w:val="1"/>
+      <w:numFmt w:val="bullet"/>
+      <w:lvlText w:val=""/>
+      <w:lvlJc w:val="left"/>
+      <w:pPr>
+        <w:tabs>
+          <w:tab w:val="num" w:pos="6480"/>
+        </w:tabs>
+        <w:ind w:left="6480" w:hanging="360"/>
+      </w:pPr>
+      <w:rPr>
+        <w:rFonts w:ascii="Symbol" w:hAnsi="Symbol" w:hint="default"/>
+        <w:sz w:val="20"/>
+      </w:rPr>
+    </w:lvl>
+  </w:abstractNum>
+  <w:abstractNum w:abstractNumId="13" w15:restartNumberingAfterBreak="0">
+    <w:nsid w:val="66355488"/>
+    <w:multiLevelType w:val="multilevel"/>
+    <w:tmpl w:val="339E8072"/>
+    <w:lvl w:ilvl="0">
+      <w:start w:val="1"/>
+      <w:numFmt w:val="decimal"/>
+      <w:lvlText w:val="%1."/>
+      <w:lvlJc w:val="left"/>
+      <w:pPr>
+        <w:tabs>
+          <w:tab w:val="num" w:pos="720"/>
+        </w:tabs>
+        <w:ind w:left="720" w:hanging="360"/>
+      </w:pPr>
+    </w:lvl>
+    <w:lvl w:ilvl="1" w:tentative="1">
+      <w:start w:val="1"/>
+      <w:numFmt w:val="decimal"/>
+      <w:lvlText w:val="%2."/>
+      <w:lvlJc w:val="left"/>
+      <w:pPr>
+        <w:tabs>
+          <w:tab w:val="num" w:pos="1440"/>
+        </w:tabs>
+        <w:ind w:left="1440" w:hanging="360"/>
+      </w:pPr>
+    </w:lvl>
+    <w:lvl w:ilvl="2" w:tentative="1">
+      <w:start w:val="1"/>
+      <w:numFmt w:val="decimal"/>
+      <w:lvlText w:val="%3."/>
+      <w:lvlJc w:val="left"/>
+      <w:pPr>
+        <w:tabs>
+          <w:tab w:val="num" w:pos="2160"/>
+        </w:tabs>
+        <w:ind w:left="2160" w:hanging="360"/>
+      </w:pPr>
+    </w:lvl>
+    <w:lvl w:ilvl="3" w:tentative="1">
+      <w:start w:val="1"/>
+      <w:numFmt w:val="decimal"/>
+      <w:lvlText w:val="%4."/>
+      <w:lvlJc w:val="left"/>
+      <w:pPr>
+        <w:tabs>
+          <w:tab w:val="num" w:pos="2880"/>
+        </w:tabs>
+        <w:ind w:left="2880" w:hanging="360"/>
+      </w:pPr>
+    </w:lvl>
+    <w:lvl w:ilvl="4" w:tentative="1">
+      <w:start w:val="1"/>
+      <w:numFmt w:val="decimal"/>
+      <w:lvlText w:val="%5."/>
+      <w:lvlJc w:val="left"/>
+      <w:pPr>
+        <w:tabs>
+          <w:tab w:val="num" w:pos="3600"/>
+        </w:tabs>
+        <w:ind w:left="3600" w:hanging="360"/>
+      </w:pPr>
+    </w:lvl>
+    <w:lvl w:ilvl="5" w:tentative="1">
+      <w:start w:val="1"/>
+      <w:numFmt w:val="decimal"/>
+      <w:lvlText w:val="%6."/>
+      <w:lvlJc w:val="left"/>
+      <w:pPr>
+        <w:tabs>
+          <w:tab w:val="num" w:pos="4320"/>
+        </w:tabs>
+        <w:ind w:left="4320" w:hanging="360"/>
+      </w:pPr>
+    </w:lvl>
+    <w:lvl w:ilvl="6" w:tentative="1">
+      <w:start w:val="1"/>
+      <w:numFmt w:val="decimal"/>
+      <w:lvlText w:val="%7."/>
+      <w:lvlJc w:val="left"/>
+      <w:pPr>
+        <w:tabs>
+          <w:tab w:val="num" w:pos="5040"/>
+        </w:tabs>
+        <w:ind w:left="5040" w:hanging="360"/>
+      </w:pPr>
+    </w:lvl>
+    <w:lvl w:ilvl="7" w:tentative="1">
+      <w:start w:val="1"/>
+      <w:numFmt w:val="decimal"/>
+      <w:lvlText w:val="%8."/>
+      <w:lvlJc w:val="left"/>
+      <w:pPr>
+        <w:tabs>
+          <w:tab w:val="num" w:pos="5760"/>
+        </w:tabs>
+        <w:ind w:left="5760" w:hanging="360"/>
+      </w:pPr>
+    </w:lvl>
+    <w:lvl w:ilvl="8" w:tentative="1">
+      <w:start w:val="1"/>
+      <w:numFmt w:val="decimal"/>
+      <w:lvlText w:val="%9."/>
+      <w:lvlJc w:val="left"/>
+      <w:pPr>
+        <w:tabs>
+          <w:tab w:val="num" w:pos="6480"/>
+        </w:tabs>
+        <w:ind w:left="6480" w:hanging="360"/>
+      </w:pPr>
+    </w:lvl>
+  </w:abstractNum>
+  <w:abstractNum w:abstractNumId="14" w15:restartNumberingAfterBreak="0">
+    <w:nsid w:val="7FE41801"/>
+    <w:multiLevelType w:val="multilevel"/>
+    <w:tmpl w:val="2C787D08"/>
     <w:lvl w:ilvl="0">
       <w:start w:val="1"/>
       <w:numFmt w:val="bullet"/>
@@ -8903,13 +9686,22 @@
     <w:abstractNumId w:val="0"/>
   </w:num>
   <w:num w:numId="10" w16cid:durableId="1298687629">
+    <w:abstractNumId w:val="11"/>
+  </w:num>
+  <w:num w:numId="11" w16cid:durableId="551042454">
     <w:abstractNumId w:val="10"/>
   </w:num>
-  <w:num w:numId="11" w16cid:durableId="551042454">
+  <w:num w:numId="12" w16cid:durableId="297078063">
+    <w:abstractNumId w:val="12"/>
+  </w:num>
+  <w:num w:numId="13" w16cid:durableId="2051149607">
+    <w:abstractNumId w:val="13"/>
+  </w:num>
+  <w:num w:numId="14" w16cid:durableId="537468682">
+    <w:abstractNumId w:val="14"/>
+  </w:num>
+  <w:num w:numId="15" w16cid:durableId="1599367418">
     <w:abstractNumId w:val="9"/>
-  </w:num>
-  <w:num w:numId="12" w16cid:durableId="297078063">
-    <w:abstractNumId w:val="11"/>
   </w:num>
 </w:numbering>
 </file>

</xml_diff>

<commit_message>
gia tien, san pham
</commit_message>
<xml_diff>
--- a/BaoCao_TienDo_ThanhVien2.docx
+++ b/BaoCao_TienDo_ThanhVien2.docx
@@ -8683,6 +8683,217 @@
       <w:pPr>
         <w:spacing w:after="120"/>
       </w:pPr>
+      <w:r>
+        <w:rPr>
+          <w:b/>
+          <w:bCs/>
+        </w:rPr>
+        <w:t>Thay đổi:</w:t>
+      </w:r>
+    </w:p>
+    <w:p>
+      <w:pPr>
+        <w:numPr>
+          <w:ilvl w:val="0"/>
+          <w:numId w:val="16"/>
+        </w:numPr>
+        <w:spacing w:after="120"/>
+      </w:pPr>
+      <w:r>
+        <w:rPr>
+          <w:b/>
+          <w:bCs/>
+        </w:rPr>
+        <w:t>Danh sách chính</w:t>
+      </w:r>
+      <w:r>
+        <w:t> - Hiển thị ngay:</w:t>
+      </w:r>
+    </w:p>
+    <w:p>
+      <w:pPr>
+        <w:numPr>
+          <w:ilvl w:val="1"/>
+          <w:numId w:val="16"/>
+        </w:numPr>
+        <w:spacing w:after="120"/>
+      </w:pPr>
+      <w:r>
+        <w:t>Mã đơn + Ngày đặt</w:t>
+      </w:r>
+    </w:p>
+    <w:p>
+      <w:pPr>
+        <w:numPr>
+          <w:ilvl w:val="1"/>
+          <w:numId w:val="16"/>
+        </w:numPr>
+        <w:spacing w:after="120"/>
+      </w:pPr>
+      <w:r>
+        <w:rPr>
+          <w:b/>
+          <w:bCs/>
+        </w:rPr>
+        <w:t>Sản phẩm</w:t>
+      </w:r>
+      <w:r>
+        <w:t> (tên, số lượng, giá tiền) - hiện 2 sản phẩm đầu, "+n sản phẩm khác" nếu có nhiều hơn</w:t>
+      </w:r>
+    </w:p>
+    <w:p>
+      <w:pPr>
+        <w:numPr>
+          <w:ilvl w:val="1"/>
+          <w:numId w:val="16"/>
+        </w:numPr>
+        <w:spacing w:after="120"/>
+      </w:pPr>
+      <w:r>
+        <w:t>Khách hàng + Người đặt (tên/email)</w:t>
+      </w:r>
+    </w:p>
+    <w:p>
+      <w:pPr>
+        <w:numPr>
+          <w:ilvl w:val="1"/>
+          <w:numId w:val="16"/>
+        </w:numPr>
+        <w:spacing w:after="120"/>
+      </w:pPr>
+      <w:r>
+        <w:rPr>
+          <w:b/>
+          <w:bCs/>
+        </w:rPr>
+        <w:t>Tổng tiền</w:t>
+      </w:r>
+    </w:p>
+    <w:p>
+      <w:pPr>
+        <w:numPr>
+          <w:ilvl w:val="1"/>
+          <w:numId w:val="16"/>
+        </w:numPr>
+        <w:spacing w:after="120"/>
+      </w:pPr>
+      <w:r>
+        <w:t>Trạng thái</w:t>
+      </w:r>
+    </w:p>
+    <w:p>
+      <w:pPr>
+        <w:numPr>
+          <w:ilvl w:val="0"/>
+          <w:numId w:val="16"/>
+        </w:numPr>
+        <w:spacing w:after="120"/>
+      </w:pPr>
+      <w:r>
+        <w:rPr>
+          <w:b/>
+          <w:bCs/>
+        </w:rPr>
+        <w:t>Phần mở rộng</w:t>
+      </w:r>
+      <w:r>
+        <w:t> - Chi tiết đầy đủ:</w:t>
+      </w:r>
+    </w:p>
+    <w:p>
+      <w:pPr>
+        <w:numPr>
+          <w:ilvl w:val="1"/>
+          <w:numId w:val="16"/>
+        </w:numPr>
+        <w:spacing w:after="120"/>
+      </w:pPr>
+      <w:r>
+        <w:t>Tên sản phẩm, SKU, </w:t>
+      </w:r>
+      <w:r>
+        <w:rPr>
+          <w:b/>
+          <w:bCs/>
+        </w:rPr>
+        <w:t>giá tiền/unit</w:t>
+      </w:r>
+      <w:r>
+        <w:t>, số lượng, thành tiền</w:t>
+      </w:r>
+    </w:p>
+    <w:p>
+      <w:pPr>
+        <w:numPr>
+          <w:ilvl w:val="1"/>
+          <w:numId w:val="16"/>
+        </w:numPr>
+        <w:spacing w:after="120"/>
+      </w:pPr>
+      <w:r>
+        <w:t>Người nhận + SĐT</w:t>
+      </w:r>
+    </w:p>
+    <w:p>
+      <w:pPr>
+        <w:numPr>
+          <w:ilvl w:val="1"/>
+          <w:numId w:val="16"/>
+        </w:numPr>
+        <w:spacing w:after="120"/>
+      </w:pPr>
+      <w:r>
+        <w:t>Địa chỉ giao hàng</w:t>
+      </w:r>
+    </w:p>
+    <w:p>
+      <w:pPr>
+        <w:numPr>
+          <w:ilvl w:val="1"/>
+          <w:numId w:val="16"/>
+        </w:numPr>
+        <w:spacing w:after="120"/>
+      </w:pPr>
+      <w:r>
+        <w:t>Nút Xác nhận / Hủy đơn</w:t>
+      </w:r>
+    </w:p>
+    <w:p>
+      <w:pPr>
+        <w:numPr>
+          <w:ilvl w:val="1"/>
+          <w:numId w:val="16"/>
+        </w:numPr>
+        <w:spacing w:after="120"/>
+      </w:pPr>
+      <w:r>
+        <w:t>Tổng tiền</w:t>
+      </w:r>
+    </w:p>
+    <w:p>
+      <w:pPr>
+        <w:numPr>
+          <w:ilvl w:val="0"/>
+          <w:numId w:val="16"/>
+        </w:numPr>
+        <w:spacing w:after="120"/>
+      </w:pPr>
+      <w:r>
+        <w:rPr>
+          <w:b/>
+          <w:bCs/>
+        </w:rPr>
+        <w:lastRenderedPageBreak/>
+        <w:t>Doanh thu</w:t>
+      </w:r>
+      <w:r>
+        <w:t> - Đã sửa chỉ tính đơn CONFIRMED (những đơn admin bấm xác nhận)</w:t>
+      </w:r>
+    </w:p>
+    <w:p>
+      <w:pPr>
+        <w:spacing w:after="120"/>
+      </w:pPr>
     </w:p>
     <w:p>
       <w:pPr>
@@ -9135,6 +9346,123 @@
     </w:lvl>
   </w:abstractNum>
   <w:abstractNum w:abstractNumId="11" w15:restartNumberingAfterBreak="0">
+    <w:nsid w:val="48D66C0B"/>
+    <w:multiLevelType w:val="multilevel"/>
+    <w:tmpl w:val="7F1CC488"/>
+    <w:lvl w:ilvl="0">
+      <w:start w:val="1"/>
+      <w:numFmt w:val="decimal"/>
+      <w:lvlText w:val="%1."/>
+      <w:lvlJc w:val="left"/>
+      <w:pPr>
+        <w:tabs>
+          <w:tab w:val="num" w:pos="720"/>
+        </w:tabs>
+        <w:ind w:left="720" w:hanging="360"/>
+      </w:pPr>
+    </w:lvl>
+    <w:lvl w:ilvl="1">
+      <w:start w:val="1"/>
+      <w:numFmt w:val="bullet"/>
+      <w:lvlText w:val=""/>
+      <w:lvlJc w:val="left"/>
+      <w:pPr>
+        <w:tabs>
+          <w:tab w:val="num" w:pos="1440"/>
+        </w:tabs>
+        <w:ind w:left="1440" w:hanging="360"/>
+      </w:pPr>
+      <w:rPr>
+        <w:rFonts w:ascii="Symbol" w:hAnsi="Symbol" w:hint="default"/>
+        <w:sz w:val="20"/>
+      </w:rPr>
+    </w:lvl>
+    <w:lvl w:ilvl="2" w:tentative="1">
+      <w:start w:val="1"/>
+      <w:numFmt w:val="decimal"/>
+      <w:lvlText w:val="%3."/>
+      <w:lvlJc w:val="left"/>
+      <w:pPr>
+        <w:tabs>
+          <w:tab w:val="num" w:pos="2160"/>
+        </w:tabs>
+        <w:ind w:left="2160" w:hanging="360"/>
+      </w:pPr>
+    </w:lvl>
+    <w:lvl w:ilvl="3" w:tentative="1">
+      <w:start w:val="1"/>
+      <w:numFmt w:val="decimal"/>
+      <w:lvlText w:val="%4."/>
+      <w:lvlJc w:val="left"/>
+      <w:pPr>
+        <w:tabs>
+          <w:tab w:val="num" w:pos="2880"/>
+        </w:tabs>
+        <w:ind w:left="2880" w:hanging="360"/>
+      </w:pPr>
+    </w:lvl>
+    <w:lvl w:ilvl="4" w:tentative="1">
+      <w:start w:val="1"/>
+      <w:numFmt w:val="decimal"/>
+      <w:lvlText w:val="%5."/>
+      <w:lvlJc w:val="left"/>
+      <w:pPr>
+        <w:tabs>
+          <w:tab w:val="num" w:pos="3600"/>
+        </w:tabs>
+        <w:ind w:left="3600" w:hanging="360"/>
+      </w:pPr>
+    </w:lvl>
+    <w:lvl w:ilvl="5" w:tentative="1">
+      <w:start w:val="1"/>
+      <w:numFmt w:val="decimal"/>
+      <w:lvlText w:val="%6."/>
+      <w:lvlJc w:val="left"/>
+      <w:pPr>
+        <w:tabs>
+          <w:tab w:val="num" w:pos="4320"/>
+        </w:tabs>
+        <w:ind w:left="4320" w:hanging="360"/>
+      </w:pPr>
+    </w:lvl>
+    <w:lvl w:ilvl="6" w:tentative="1">
+      <w:start w:val="1"/>
+      <w:numFmt w:val="decimal"/>
+      <w:lvlText w:val="%7."/>
+      <w:lvlJc w:val="left"/>
+      <w:pPr>
+        <w:tabs>
+          <w:tab w:val="num" w:pos="5040"/>
+        </w:tabs>
+        <w:ind w:left="5040" w:hanging="360"/>
+      </w:pPr>
+    </w:lvl>
+    <w:lvl w:ilvl="7" w:tentative="1">
+      <w:start w:val="1"/>
+      <w:numFmt w:val="decimal"/>
+      <w:lvlText w:val="%8."/>
+      <w:lvlJc w:val="left"/>
+      <w:pPr>
+        <w:tabs>
+          <w:tab w:val="num" w:pos="5760"/>
+        </w:tabs>
+        <w:ind w:left="5760" w:hanging="360"/>
+      </w:pPr>
+    </w:lvl>
+    <w:lvl w:ilvl="8" w:tentative="1">
+      <w:start w:val="1"/>
+      <w:numFmt w:val="decimal"/>
+      <w:lvlText w:val="%9."/>
+      <w:lvlJc w:val="left"/>
+      <w:pPr>
+        <w:tabs>
+          <w:tab w:val="num" w:pos="6480"/>
+        </w:tabs>
+        <w:ind w:left="6480" w:hanging="360"/>
+      </w:pPr>
+    </w:lvl>
+  </w:abstractNum>
+  <w:abstractNum w:abstractNumId="12" w15:restartNumberingAfterBreak="0">
     <w:nsid w:val="49340DC8"/>
     <w:multiLevelType w:val="multilevel"/>
     <w:tmpl w:val="DDC44B78"/>
@@ -9247,7 +9575,7 @@
       </w:pPr>
     </w:lvl>
   </w:abstractNum>
-  <w:abstractNum w:abstractNumId="12" w15:restartNumberingAfterBreak="0">
+  <w:abstractNum w:abstractNumId="13" w15:restartNumberingAfterBreak="0">
     <w:nsid w:val="53495B6A"/>
     <w:multiLevelType w:val="multilevel"/>
     <w:tmpl w:val="5B7CF5FA"/>
@@ -9396,7 +9724,7 @@
       </w:rPr>
     </w:lvl>
   </w:abstractNum>
-  <w:abstractNum w:abstractNumId="13" w15:restartNumberingAfterBreak="0">
+  <w:abstractNum w:abstractNumId="14" w15:restartNumberingAfterBreak="0">
     <w:nsid w:val="66355488"/>
     <w:multiLevelType w:val="multilevel"/>
     <w:tmpl w:val="339E8072"/>
@@ -9509,7 +9837,7 @@
       </w:pPr>
     </w:lvl>
   </w:abstractNum>
-  <w:abstractNum w:abstractNumId="14" w15:restartNumberingAfterBreak="0">
+  <w:abstractNum w:abstractNumId="15" w15:restartNumberingAfterBreak="0">
     <w:nsid w:val="7FE41801"/>
     <w:multiLevelType w:val="multilevel"/>
     <w:tmpl w:val="2C787D08"/>
@@ -9686,22 +10014,25 @@
     <w:abstractNumId w:val="0"/>
   </w:num>
   <w:num w:numId="10" w16cid:durableId="1298687629">
-    <w:abstractNumId w:val="11"/>
+    <w:abstractNumId w:val="12"/>
   </w:num>
   <w:num w:numId="11" w16cid:durableId="551042454">
     <w:abstractNumId w:val="10"/>
   </w:num>
   <w:num w:numId="12" w16cid:durableId="297078063">
-    <w:abstractNumId w:val="12"/>
+    <w:abstractNumId w:val="13"/>
   </w:num>
   <w:num w:numId="13" w16cid:durableId="2051149607">
-    <w:abstractNumId w:val="13"/>
+    <w:abstractNumId w:val="14"/>
   </w:num>
   <w:num w:numId="14" w16cid:durableId="537468682">
-    <w:abstractNumId w:val="14"/>
+    <w:abstractNumId w:val="15"/>
   </w:num>
   <w:num w:numId="15" w16cid:durableId="1599367418">
     <w:abstractNumId w:val="9"/>
+  </w:num>
+  <w:num w:numId="16" w16cid:durableId="462887203">
+    <w:abstractNumId w:val="11"/>
   </w:num>
 </w:numbering>
 </file>

</xml_diff>